<commit_message>
docs: document validated Trustpilot Vapoter collection
</commit_message>
<xml_diff>
--- a/deliverables/04_MVP_Roadmap_Academique.docx
+++ b/deliverables/04_MVP_Roadmap_Academique.docx
@@ -56,7 +56,7 @@
     <w:p>
       <w:pPr/>
       <w:r>
-        <w:t>Les quatre KPI de cadrage sont la note moyenne, la part d'avis négatifs, le taux de réponse visible lorsque son statut est fiable, et le volume d'avis analysés comme indicateur de couverture. Le rapport ne doit pas extrapoler des résultats d'un échantillon par étoiles ou d'une collecte interrompue. La tentative réelle Showroomprivé s'est arrêtée sur HTTP 403 : zéro avis extrait, donc pas de preuve de collecte exhaustive de plus de 10 000 avis.</w:t>
+        <w:t>Les quatre KPI de cadrage sont la note moyenne, la part d'avis négatifs, le taux de réponse visible lorsque son statut est fiable, et le volume d'avis analysés comme indicateur de couverture. Le rapport ne doit pas extrapoler des résultats d'un échantillon par étoiles ou d'une collecte interrompue. L'ancienne tentative Showroomprivé s'est arrêtée sur HTTP 403 ; la collecte privée Vapoter démontre ensuite 11 281 IDs sur les vues accessibles, sans intégration automatique au MVP.</w:t>
       </w:r>
     </w:p>
     <w:p>
@@ -286,7 +286,7 @@
     <w:p>
       <w:pPr/>
       <w:r>
-        <w:t>La SWOT conserve comme faiblesse la collecte &gt;10 000 non démontrée, et comme menace l'accès aux données et le cadre légal. La veille distingue obligation juridique, recommandation et pratique volontaire : présence possible de données personnelles dans les avis, restrictions contractuelles de plateformes, durée de conservation à définir, qualification AI Act et RGAA à examiner selon l'usage réel. Ces points bornent la démonstration ; ils ne déclenchent aucune nouvelle fonctionnalité dans ce chantier.</w:t>
+        <w:t>La SWOT conserve comme faiblesse les limites de provenance et de réutilisation des données, et comme menace l'accès aux données et le cadre légal. La veille distingue obligation juridique, recommandation et pratique volontaire : présence possible de données personnelles dans les avis, restrictions contractuelles de plateformes, durée de conservation à définir, qualification AI Act et RGAA à examiner selon l'usage réel. Ces points bornent la démonstration ; ils ne déclenchent aucune nouvelle fonctionnalité dans ce chantier.</w:t>
       </w:r>
     </w:p>
     <w:p>

</xml_diff>

<commit_message>
docs: document ML optimization and project cost estimates
</commit_message>
<xml_diff>
--- a/deliverables/04_MVP_Roadmap_Academique.docx
+++ b/deliverables/04_MVP_Roadmap_Academique.docx
@@ -12,22 +12,13 @@
     </w:p>
     <w:p>
       <w:r>
-        <w:rPr>
-          <w:b/>
-        </w:rPr>
-        <w:t xml:space="preserve">Objet. </w:t>
-      </w:r>
-      <w:r>
-        <w:t xml:space="preserve">Présenter les choix du MVP, leurs limites et les jalons vérifiables avant la soutenance. </w:t>
-      </w:r>
-      <w:r>
-        <w:t>La date officielle de soutenance n'est pas connue ; aucun coût ni résultat manquant n'est estimé.</w:t>
+        <w:t>Objet. Présenter les choix du MVP, les jalons et une valorisation pédagogique des ressources. La date officielle de soutenance n'est pas connue ; les hypothèses financières ne sont pas des dépenses constatées.</w:t>
       </w:r>
     </w:p>
     <w:p>
       <w:pPr/>
       <w:r>
-        <w:t>État au 22 septembre 2026 ; voir Discovery, veille, SWOT source et roadmap.</w:t>
+        <w:t>Choix du MVP documentés le 22 septembre 2026 ; scénario de ressources ajouté le 30 septembre 2026 ; voir Discovery, veille, SWOT source et roadmap.</w:t>
       </w:r>
     </w:p>
     <w:p>
@@ -226,7 +217,7 @@
     <w:p>
       <w:pPr/>
       <w:r>
-        <w:t>Profils envisagés : responsable service client, responsable supply chain, responsable expérience client, analyste data, direction ; aucun entretien réalisé. L'équipe projet utilise le dépôt Git, Python/scikit-learn, PostgreSQL, MLflow, FastAPI, React, Celery/Redis, Docker Compose, GitHub Actions et la VM scolaire déjà mise à disposition. Aucun abonnement nouveau n'est requis pour les livrables documentaires ; le temps humain et le coût alloué de la VM ne sont pas chiffrés. La roadmap détaille jalons, validation et maintenance.</w:t>
+        <w:t>Profils envisagés : responsable service client, responsable supply chain, responsable expérience client, analyste data, direction ; aucun entretien réalisé. L'équipe projet utilise une machine personnelle existante, le dépôt Git, Python/scikit-learn, PostgreSQL, MLflow, FastAPI, React, Celery/Redis, Docker Compose, GitHub Actions et la VM scolaire fournie. La dépense cash réelle totale n'est pas déterminable ; la roadmap ci-dessous présente uniquement une valorisation illustrative.</w:t>
       </w:r>
     </w:p>
     <w:p>
@@ -300,16 +291,7 @@
     <w:p>
       <w:pPr/>
       <w:r>
-        <w:t xml:space="preserve">État documenté le 22 septembre 2026. </w:t>
-      </w:r>
-      <w:r>
-        <w:rPr>
-          <w:b/>
-        </w:rPr>
-        <w:t>La date de soutenance n'a pas été communiquée</w:t>
-      </w:r>
-      <w:r>
-        <w:t xml:space="preserve"> : les périodes « avant soutenance » sont relatives et ne prétendent pas fixer un calendrier officiel. Les dates passées ci-dessous correspondent aux preuves connues ; elles ne réécrivent pas l'historique du projet.</w:t>
+        <w:t>Jalons documentés le 22 septembre 2026 ; scénario de ressources ajouté le 30 septembre 2026. La date de soutenance n'a pas été communiquée : les périodes « avant soutenance » sont relatives et ne prétendent pas fixer un calendrier officiel. Les dates passées ci-dessous correspondent aux preuves connues ; elles ne réécrivent pas l'historique du projet.</w:t>
       </w:r>
     </w:p>
     <w:p>
@@ -358,13 +340,7 @@
         <w:keepNext/>
       </w:pPr>
       <w:r>
-        <w:rPr>
-          <w:b/>
-        </w:rPr>
-        <w:t xml:space="preserve">Ressources humaines, techniques et monétaires. </w:t>
-      </w:r>
-      <w:r>
-        <w:t>Équipe projet ; corpus disponible, scikit-learn, MLflow, PostgreSQL. Outils open source, aucune nouvelle licence achetée pour le MVP ; temps humain non valorisé.</w:t>
+        <w:t>Ressources humaines, techniques et monétaires. Équipe projet ; corpus disponible, scikit-learn, MLflow, PostgreSQL. Outils open source, aucune nouvelle licence achetée pour le MVP ; valorisation humaine illustrative détaillée en fin de document.</w:t>
       </w:r>
     </w:p>
     <w:p>
@@ -425,13 +401,7 @@
         <w:keepNext/>
       </w:pPr>
       <w:r>
-        <w:rPr>
-          <w:b/>
-        </w:rPr>
-        <w:t xml:space="preserve">Ressources humaines, techniques et monétaires. </w:t>
-      </w:r>
-      <w:r>
-        <w:t>Équipe projet ; GitHub Actions utilisé pour la CI et les workflows, Ansible et Docker Compose. VM scolaire déjà mise à disposition par la formation : aucun nouveau coût d'infrastructure engagé par le projet.</w:t>
+        <w:t>Ressources humaines, techniques et monétaires. Équipe projet ; GitHub Actions utilisé pour la CI et les workflows, Ansible et Docker Compose. VM scolaire déjà mise à disposition par la formation : coût alloué et dépense cash réelle non documentés.</w:t>
       </w:r>
     </w:p>
     <w:p>
@@ -510,13 +480,7 @@
         <w:keepNext/>
       </w:pPr>
       <w:r>
-        <w:rPr>
-          <w:b/>
-        </w:rPr>
-        <w:t xml:space="preserve">Ressources humaines, techniques et monétaires. </w:t>
-      </w:r>
-      <w:r>
-        <w:t>GitHub Actions déjà utilisé pour les workflows ; aucun nouveau service souscrit pour ce jalon, sans supposer un prix ou un quota.</w:t>
+        <w:t>Ressources humaines, techniques et monétaires. GitHub Actions déjà utilisé pour les workflows ; aucun montant facturé déduit de cet usage, sans supposer un prix ou un quota.</w:t>
       </w:r>
     </w:p>
     <w:p>
@@ -592,13 +556,7 @@
         <w:keepNext/>
       </w:pPr>
       <w:r>
-        <w:rPr>
-          <w:b/>
-        </w:rPr>
-        <w:t xml:space="preserve">Ressources humaines, techniques et monétaires. </w:t>
-      </w:r>
-      <w:r>
-        <w:t>Équipe projet et, si disponible, relecteur métier ; dépôt et sources officielles. Aucun nouvel achat prévu pour les sources Markdown ; outil d'export final à choisir parmi les moyens déjà disponibles. Temps de rédaction non valorisé.</w:t>
+        <w:t>Ressources humaines, techniques et monétaires. Équipe projet et, si disponible, relecteur métier ; dépôt et sources officielles. Aucun nouvel achat prévu pour les sources Markdown ; outil d'export final à choisir parmi les moyens déjà disponibles. Valorisation pédagogique de la documentation détaillée en fin de document.</w:t>
       </w:r>
     </w:p>
     <w:p>
@@ -665,13 +623,7 @@
         <w:keepNext/>
       </w:pPr>
       <w:r>
-        <w:rPr>
-          <w:b/>
-        </w:rPr>
-        <w:t xml:space="preserve">Ressources humaines, techniques et monétaires. </w:t>
-      </w:r>
-      <w:r>
-        <w:t>Équipe projet ; environnement scolaire existant ou captures archivées si VM indisponible. Aucun nouvel achat prévu ; temps humain non valorisé.</w:t>
+        <w:t>Ressources humaines, techniques et monétaires. Équipe projet ; environnement scolaire existant ou captures archivées si VM indisponible. Aucun nouvel achat prévu ; valorisation humaine illustrative détaillée en fin de document.</w:t>
       </w:r>
     </w:p>
     <w:p>
@@ -804,49 +756,622 @@
         <w:pStyle w:val="Heading1"/>
       </w:pPr>
       <w:r>
-        <w:t>Ressources et coûts — limites du chiffrage</w:t>
+        <w:t>Ressources et coûts — scénario pédagogique</w:t>
       </w:r>
     </w:p>
     <w:p>
       <w:pPr/>
       <w:r>
-        <w:t xml:space="preserve">La </w:t>
+        <w:t>Le projet mobilise une machine personnelle existante et une VM scolaire fournie. GitHub et GitHub Actions servent au dépôt et à la CI ; Docker, PostgreSQL, Redis, MLflow, FastAPI, React, scikit-learn et Ansible sont effectivement employés. Leur caractère open source ou fourni ne rend pas nul le coût économique du projet. Aucun relevé complet des dépenses engagées n'est disponible : la dépense cash réelle totale n'est pas déterminable. Le tableau suivant est une hypothèse pédagogique : 36 jours-personne à 350 € de TJM indicatif. Ces jours ne constituent pas un relevé du temps passé et les 12 600 € ne sont pas une dépense réellement engagée.</w:t>
       </w:r>
+    </w:p>
+    <w:p>
       <w:r>
-        <w:rPr>
-          <w:b/>
-        </w:rPr>
-        <w:t>VM scolaire existante</w:t>
+        <w:br w:type="page"/>
       </w:r>
+    </w:p>
+    <w:p>
+      <w:pPr>
+        <w:pStyle w:val="Heading2"/>
+      </w:pPr>
       <w:r>
-        <w:t xml:space="preserve"> est mise à disposition dans le cadre de la formation : le projet n'a engagé aucun nouveau coût d'infrastructure pour ce MVP. </w:t>
+        <w:t>Valorisation indicative par phase</w:t>
       </w:r>
+    </w:p>
+    <w:tbl>
+      <w:tblPr>
+        <w:tblStyle w:val="TableGrid"/>
+        <w:tblW w:type="auto" w:w="0"/>
+        <w:jc w:val="center"/>
+        <w:tblLook w:firstColumn="1" w:firstRow="1" w:lastColumn="0" w:lastRow="0" w:noHBand="0" w:noVBand="1" w:val="04A0"/>
+      </w:tblPr>
+      <w:tblGrid>
+        <w:gridCol w:w="1928"/>
+        <w:gridCol w:w="1928"/>
+        <w:gridCol w:w="1928"/>
+        <w:gridCol w:w="1928"/>
+        <w:gridCol w:w="1928"/>
+      </w:tblGrid>
+      <w:tr>
+        <w:tc>
+          <w:tcPr>
+            <w:tcW w:type="dxa" w:w="1928"/>
+            <w:vAlign w:val="center"/>
+          </w:tcPr>
+          <w:p>
+            <w:r>
+              <w:rPr>
+                <w:sz w:val="16"/>
+              </w:rPr>
+              <w:t>Étape</w:t>
+            </w:r>
+          </w:p>
+        </w:tc>
+        <w:tc>
+          <w:tcPr>
+            <w:tcW w:type="dxa" w:w="1928"/>
+            <w:vAlign w:val="center"/>
+          </w:tcPr>
+          <w:p>
+            <w:r>
+              <w:rPr>
+                <w:sz w:val="16"/>
+              </w:rPr>
+              <w:t>Ressource humaine</w:t>
+            </w:r>
+          </w:p>
+        </w:tc>
+        <w:tc>
+          <w:tcPr>
+            <w:tcW w:type="dxa" w:w="1928"/>
+            <w:vAlign w:val="center"/>
+          </w:tcPr>
+          <w:p>
+            <w:r>
+              <w:rPr>
+                <w:sz w:val="16"/>
+              </w:rPr>
+              <w:t>Ressource technique</w:t>
+            </w:r>
+          </w:p>
+        </w:tc>
+        <w:tc>
+          <w:tcPr>
+            <w:tcW w:type="dxa" w:w="1928"/>
+            <w:vAlign w:val="center"/>
+          </w:tcPr>
+          <w:p>
+            <w:r>
+              <w:rPr>
+                <w:sz w:val="16"/>
+              </w:rPr>
+              <w:t>Coût cash réel</w:t>
+            </w:r>
+          </w:p>
+        </w:tc>
+        <w:tc>
+          <w:tcPr>
+            <w:tcW w:type="dxa" w:w="1928"/>
+            <w:vAlign w:val="center"/>
+          </w:tcPr>
+          <w:p>
+            <w:r>
+              <w:rPr>
+                <w:sz w:val="16"/>
+              </w:rPr>
+              <w:t>Hypothèse / valorisation</w:t>
+            </w:r>
+          </w:p>
+        </w:tc>
+      </w:tr>
+      <w:tr>
+        <w:tc>
+          <w:tcPr>
+            <w:tcW w:type="dxa" w:w="1928"/>
+            <w:vAlign w:val="center"/>
+          </w:tcPr>
+          <w:p>
+            <w:r>
+              <w:rPr>
+                <w:sz w:val="16"/>
+              </w:rPr>
+              <w:t>Discovery, cadrage, veille</w:t>
+            </w:r>
+          </w:p>
+        </w:tc>
+        <w:tc>
+          <w:tcPr>
+            <w:tcW w:type="dxa" w:w="1928"/>
+            <w:vAlign w:val="center"/>
+          </w:tcPr>
+          <w:p>
+            <w:r>
+              <w:rPr>
+                <w:sz w:val="16"/>
+              </w:rPr>
+              <w:t>Équipe projet</w:t>
+            </w:r>
+          </w:p>
+        </w:tc>
+        <w:tc>
+          <w:tcPr>
+            <w:tcW w:type="dxa" w:w="1928"/>
+            <w:vAlign w:val="center"/>
+          </w:tcPr>
+          <w:p>
+            <w:r>
+              <w:rPr>
+                <w:sz w:val="16"/>
+              </w:rPr>
+              <w:t>PC personnel, GitHub, sources</w:t>
+            </w:r>
+          </w:p>
+        </w:tc>
+        <w:tc>
+          <w:tcPr>
+            <w:tcW w:type="dxa" w:w="1928"/>
+            <w:vAlign w:val="center"/>
+          </w:tcPr>
+          <w:p>
+            <w:r>
+              <w:rPr>
+                <w:sz w:val="16"/>
+              </w:rPr>
+              <w:t>Non déterminé</w:t>
+            </w:r>
+          </w:p>
+        </w:tc>
+        <w:tc>
+          <w:tcPr>
+            <w:tcW w:type="dxa" w:w="1928"/>
+            <w:vAlign w:val="center"/>
+          </w:tcPr>
+          <w:p>
+            <w:r>
+              <w:rPr>
+                <w:sz w:val="16"/>
+              </w:rPr>
+              <w:t>3 j × 350 € = 1 050 €</w:t>
+            </w:r>
+          </w:p>
+        </w:tc>
+      </w:tr>
+      <w:tr>
+        <w:tc>
+          <w:tcPr>
+            <w:tcW w:type="dxa" w:w="1928"/>
+            <w:vAlign w:val="center"/>
+          </w:tcPr>
+          <w:p>
+            <w:r>
+              <w:rPr>
+                <w:sz w:val="16"/>
+              </w:rPr>
+              <w:t>Collecte et contrôle</w:t>
+            </w:r>
+          </w:p>
+        </w:tc>
+        <w:tc>
+          <w:tcPr>
+            <w:tcW w:type="dxa" w:w="1928"/>
+            <w:vAlign w:val="center"/>
+          </w:tcPr>
+          <w:p>
+            <w:r>
+              <w:rPr>
+                <w:sz w:val="16"/>
+              </w:rPr>
+              <w:t>Équipe projet</w:t>
+            </w:r>
+          </w:p>
+        </w:tc>
+        <w:tc>
+          <w:tcPr>
+            <w:tcW w:type="dxa" w:w="1928"/>
+            <w:vAlign w:val="center"/>
+          </w:tcPr>
+          <w:p>
+            <w:r>
+              <w:rPr>
+                <w:sz w:val="16"/>
+              </w:rPr>
+              <w:t>PC, Chrome/Playwright, stockage privé</w:t>
+            </w:r>
+          </w:p>
+        </w:tc>
+        <w:tc>
+          <w:tcPr>
+            <w:tcW w:type="dxa" w:w="1928"/>
+            <w:vAlign w:val="center"/>
+          </w:tcPr>
+          <w:p>
+            <w:r>
+              <w:rPr>
+                <w:sz w:val="16"/>
+              </w:rPr>
+              <w:t>Non déterminé</w:t>
+            </w:r>
+          </w:p>
+        </w:tc>
+        <w:tc>
+          <w:tcPr>
+            <w:tcW w:type="dxa" w:w="1928"/>
+            <w:vAlign w:val="center"/>
+          </w:tcPr>
+          <w:p>
+            <w:r>
+              <w:rPr>
+                <w:sz w:val="16"/>
+              </w:rPr>
+              <w:t>8 j × 350 € = 2 800 €</w:t>
+            </w:r>
+          </w:p>
+        </w:tc>
+      </w:tr>
+      <w:tr>
+        <w:tc>
+          <w:tcPr>
+            <w:tcW w:type="dxa" w:w="1928"/>
+            <w:vAlign w:val="center"/>
+          </w:tcPr>
+          <w:p>
+            <w:r>
+              <w:rPr>
+                <w:sz w:val="16"/>
+              </w:rPr>
+              <w:t>Application, PostgreSQL, ETL</w:t>
+            </w:r>
+          </w:p>
+        </w:tc>
+        <w:tc>
+          <w:tcPr>
+            <w:tcW w:type="dxa" w:w="1928"/>
+            <w:vAlign w:val="center"/>
+          </w:tcPr>
+          <w:p>
+            <w:r>
+              <w:rPr>
+                <w:sz w:val="16"/>
+              </w:rPr>
+              <w:t>Équipe projet</w:t>
+            </w:r>
+          </w:p>
+        </w:tc>
+        <w:tc>
+          <w:tcPr>
+            <w:tcW w:type="dxa" w:w="1928"/>
+            <w:vAlign w:val="center"/>
+          </w:tcPr>
+          <w:p>
+            <w:r>
+              <w:rPr>
+                <w:sz w:val="16"/>
+              </w:rPr>
+              <w:t>PostgreSQL, Redis, FastAPI, React, Docker</w:t>
+            </w:r>
+          </w:p>
+        </w:tc>
+        <w:tc>
+          <w:tcPr>
+            <w:tcW w:type="dxa" w:w="1928"/>
+            <w:vAlign w:val="center"/>
+          </w:tcPr>
+          <w:p>
+            <w:r>
+              <w:rPr>
+                <w:sz w:val="16"/>
+              </w:rPr>
+              <w:t>Non déterminé</w:t>
+            </w:r>
+          </w:p>
+        </w:tc>
+        <w:tc>
+          <w:tcPr>
+            <w:tcW w:type="dxa" w:w="1928"/>
+            <w:vAlign w:val="center"/>
+          </w:tcPr>
+          <w:p>
+            <w:r>
+              <w:rPr>
+                <w:sz w:val="16"/>
+              </w:rPr>
+              <w:t>10 j × 350 € = 3 500 €</w:t>
+            </w:r>
+          </w:p>
+        </w:tc>
+      </w:tr>
+      <w:tr>
+        <w:tc>
+          <w:tcPr>
+            <w:tcW w:type="dxa" w:w="1928"/>
+            <w:vAlign w:val="center"/>
+          </w:tcPr>
+          <w:p>
+            <w:r>
+              <w:rPr>
+                <w:sz w:val="16"/>
+              </w:rPr>
+              <w:t>ML et évaluation</w:t>
+            </w:r>
+          </w:p>
+        </w:tc>
+        <w:tc>
+          <w:tcPr>
+            <w:tcW w:type="dxa" w:w="1928"/>
+            <w:vAlign w:val="center"/>
+          </w:tcPr>
+          <w:p>
+            <w:r>
+              <w:rPr>
+                <w:sz w:val="16"/>
+              </w:rPr>
+              <w:t>Équipe projet</w:t>
+            </w:r>
+          </w:p>
+        </w:tc>
+        <w:tc>
+          <w:tcPr>
+            <w:tcW w:type="dxa" w:w="1928"/>
+            <w:vAlign w:val="center"/>
+          </w:tcPr>
+          <w:p>
+            <w:r>
+              <w:rPr>
+                <w:sz w:val="16"/>
+              </w:rPr>
+              <w:t>scikit-learn, MLflow, corpus</w:t>
+            </w:r>
+          </w:p>
+        </w:tc>
+        <w:tc>
+          <w:tcPr>
+            <w:tcW w:type="dxa" w:w="1928"/>
+            <w:vAlign w:val="center"/>
+          </w:tcPr>
+          <w:p>
+            <w:r>
+              <w:rPr>
+                <w:sz w:val="16"/>
+              </w:rPr>
+              <w:t>Non déterminé</w:t>
+            </w:r>
+          </w:p>
+        </w:tc>
+        <w:tc>
+          <w:tcPr>
+            <w:tcW w:type="dxa" w:w="1928"/>
+            <w:vAlign w:val="center"/>
+          </w:tcPr>
+          <w:p>
+            <w:r>
+              <w:rPr>
+                <w:sz w:val="16"/>
+              </w:rPr>
+              <w:t>7 j × 350 € = 2 450 €</w:t>
+            </w:r>
+          </w:p>
+        </w:tc>
+      </w:tr>
+      <w:tr>
+        <w:tc>
+          <w:tcPr>
+            <w:tcW w:type="dxa" w:w="1928"/>
+            <w:vAlign w:val="center"/>
+          </w:tcPr>
+          <w:p>
+            <w:r>
+              <w:rPr>
+                <w:sz w:val="16"/>
+              </w:rPr>
+              <w:t>CI, déploiement, supervision</w:t>
+            </w:r>
+          </w:p>
+        </w:tc>
+        <w:tc>
+          <w:tcPr>
+            <w:tcW w:type="dxa" w:w="1928"/>
+            <w:vAlign w:val="center"/>
+          </w:tcPr>
+          <w:p>
+            <w:r>
+              <w:rPr>
+                <w:sz w:val="16"/>
+              </w:rPr>
+              <w:t>Équipe projet</w:t>
+            </w:r>
+          </w:p>
+        </w:tc>
+        <w:tc>
+          <w:tcPr>
+            <w:tcW w:type="dxa" w:w="1928"/>
+            <w:vAlign w:val="center"/>
+          </w:tcPr>
+          <w:p>
+            <w:r>
+              <w:rPr>
+                <w:sz w:val="16"/>
+              </w:rPr>
+              <w:t>GitHub Actions, Ansible, VM scolaire</w:t>
+            </w:r>
+          </w:p>
+        </w:tc>
+        <w:tc>
+          <w:tcPr>
+            <w:tcW w:type="dxa" w:w="1928"/>
+            <w:vAlign w:val="center"/>
+          </w:tcPr>
+          <w:p>
+            <w:r>
+              <w:rPr>
+                <w:sz w:val="16"/>
+              </w:rPr>
+              <w:t>Non déterminé</w:t>
+            </w:r>
+          </w:p>
+        </w:tc>
+        <w:tc>
+          <w:tcPr>
+            <w:tcW w:type="dxa" w:w="1928"/>
+            <w:vAlign w:val="center"/>
+          </w:tcPr>
+          <w:p>
+            <w:r>
+              <w:rPr>
+                <w:sz w:val="16"/>
+              </w:rPr>
+              <w:t>5 j × 350 € = 1 750 €</w:t>
+            </w:r>
+          </w:p>
+        </w:tc>
+      </w:tr>
+      <w:tr>
+        <w:tc>
+          <w:tcPr>
+            <w:tcW w:type="dxa" w:w="1928"/>
+            <w:vAlign w:val="center"/>
+          </w:tcPr>
+          <w:p>
+            <w:r>
+              <w:rPr>
+                <w:sz w:val="16"/>
+              </w:rPr>
+              <w:t>Documentation, soutenance</w:t>
+            </w:r>
+          </w:p>
+        </w:tc>
+        <w:tc>
+          <w:tcPr>
+            <w:tcW w:type="dxa" w:w="1928"/>
+            <w:vAlign w:val="center"/>
+          </w:tcPr>
+          <w:p>
+            <w:r>
+              <w:rPr>
+                <w:sz w:val="16"/>
+              </w:rPr>
+              <w:t>Équipe projet, relecteur éventuel</w:t>
+            </w:r>
+          </w:p>
+        </w:tc>
+        <w:tc>
+          <w:tcPr>
+            <w:tcW w:type="dxa" w:w="1928"/>
+            <w:vAlign w:val="center"/>
+          </w:tcPr>
+          <w:p>
+            <w:r>
+              <w:rPr>
+                <w:sz w:val="16"/>
+              </w:rPr>
+              <w:t>Dépôt, outils de rendu</w:t>
+            </w:r>
+          </w:p>
+        </w:tc>
+        <w:tc>
+          <w:tcPr>
+            <w:tcW w:type="dxa" w:w="1928"/>
+            <w:vAlign w:val="center"/>
+          </w:tcPr>
+          <w:p>
+            <w:r>
+              <w:rPr>
+                <w:sz w:val="16"/>
+              </w:rPr>
+              <w:t>Non déterminé</w:t>
+            </w:r>
+          </w:p>
+        </w:tc>
+        <w:tc>
+          <w:tcPr>
+            <w:tcW w:type="dxa" w:w="1928"/>
+            <w:vAlign w:val="center"/>
+          </w:tcPr>
+          <w:p>
+            <w:r>
+              <w:rPr>
+                <w:sz w:val="16"/>
+              </w:rPr>
+              <w:t>3 j × 350 € = 1 050 €</w:t>
+            </w:r>
+          </w:p>
+        </w:tc>
+      </w:tr>
+      <w:tr>
+        <w:tc>
+          <w:tcPr>
+            <w:tcW w:type="dxa" w:w="1928"/>
+            <w:vAlign w:val="center"/>
+          </w:tcPr>
+          <w:p>
+            <w:r>
+              <w:rPr>
+                <w:sz w:val="16"/>
+              </w:rPr>
+              <w:t>TOTAL ILLUSTRATIF</w:t>
+            </w:r>
+          </w:p>
+        </w:tc>
+        <w:tc>
+          <w:tcPr>
+            <w:tcW w:type="dxa" w:w="1928"/>
+            <w:vAlign w:val="center"/>
+          </w:tcPr>
+          <w:p>
+            <w:r>
+              <w:rPr>
+                <w:sz w:val="16"/>
+              </w:rPr>
+              <w:t>36 jours-personne supposés</w:t>
+            </w:r>
+          </w:p>
+        </w:tc>
+        <w:tc>
+          <w:tcPr>
+            <w:tcW w:type="dxa" w:w="1928"/>
+            <w:vAlign w:val="center"/>
+          </w:tcPr>
+          <w:p>
+            <w:r>
+              <w:rPr>
+                <w:sz w:val="16"/>
+              </w:rPr>
+              <w:t>Ressources existantes/fournies</w:t>
+            </w:r>
+          </w:p>
+        </w:tc>
+        <w:tc>
+          <w:tcPr>
+            <w:tcW w:type="dxa" w:w="1928"/>
+            <w:vAlign w:val="center"/>
+          </w:tcPr>
+          <w:p>
+            <w:r>
+              <w:rPr>
+                <w:sz w:val="16"/>
+              </w:rPr>
+              <w:t>Non déterminable</w:t>
+            </w:r>
+          </w:p>
+        </w:tc>
+        <w:tc>
+          <w:tcPr>
+            <w:tcW w:type="dxa" w:w="1928"/>
+            <w:vAlign w:val="center"/>
+          </w:tcPr>
+          <w:p>
+            <w:r>
+              <w:rPr>
+                <w:sz w:val="16"/>
+              </w:rPr>
+              <w:t>12 600 € — non dépensés</w:t>
+            </w:r>
+          </w:p>
+        </w:tc>
+      </w:tr>
+    </w:tbl>
+    <w:p>
       <w:r>
-        <w:rPr>
-          <w:b/>
-        </w:rPr>
-        <w:t>GitHub et GitHub Actions</w:t>
-      </w:r>
-      <w:r>
-        <w:t xml:space="preserve"> servent au dépôt, à la CI et aux workflows constatés ; aucun prix, quota ou montant facturé n'est déduit de cette utilisation. </w:t>
-      </w:r>
-      <w:r>
-        <w:rPr>
-          <w:b/>
-        </w:rPr>
-        <w:t>PostgreSQL, Redis, MLflow, Docker, FastAPI, React, scikit-learn et Ansible</w:t>
-      </w:r>
-      <w:r>
-        <w:t xml:space="preserve"> sont utilisés sans nouvelle licence achetée pour le MVP. Aucun nouvel abonnement ou service payant n'est proposé pour les livrables documentaires. Le </w:t>
-      </w:r>
-      <w:r>
-        <w:rPr>
-          <w:b/>
-        </w:rPr>
-        <w:t>temps humain</w:t>
-      </w:r>
-      <w:r>
-        <w:t xml:space="preserve"> est une ressource réelle à valoriser, mais aucun TJM, tarif horaire ou volume d'heures n'a été fixé dans le cadrage ; aucun montant fictif n'est inscrit. Ces constats de coût marginal n'établissent pas que le coût économique total du projet est nul. La date officielle de soutenance et les disponibilités des intervenants sont à renseigner avant d'assigner des échéances calendaires aux jalons restants.</w:t>
+        <w:t>Exploitation hypothétique : 50 à 100 € HT/mois pour un petit hébergement avec sauvegarde, à recalculer selon le fournisseur et la capacité. Cette fourchette n’est ni une facture réelle ni le coût mesuré de la VM scolaire.</w:t>
       </w:r>
     </w:p>
     <w:sectPr>

</xml_diff>